<commit_message>
feat: perbaikan form layanan, ui notifikasi, dan umkm
</commit_message>
<xml_diff>
--- a/apps/web/public/templates/SKU.docx
+++ b/apps/web/public/templates/SKU.docx
@@ -568,14 +568,25 @@
           <w:lang w:val="id-ID" w:eastAsia="en-ID"/>
         </w:rPr>
       </w:pPr>
-      <w:r>
-        <w:rPr>
-          <w:rFonts w:ascii="Times New Roman" w:eastAsia="Times New Roman" w:hAnsi="Times New Roman" w:cs="Times New Roman"/>
-          <w:sz w:val="24"/>
-          <w:szCs w:val="24"/>
-          <w:lang w:eastAsia="en-ID"/>
-        </w:rPr>
-        <w:t xml:space="preserve">NOMOR : </w:t>
+      <w:proofErr w:type="gramStart"/>
+      <w:r>
+        <w:rPr>
+          <w:rFonts w:ascii="Times New Roman" w:eastAsia="Times New Roman" w:hAnsi="Times New Roman" w:cs="Times New Roman"/>
+          <w:sz w:val="24"/>
+          <w:szCs w:val="24"/>
+          <w:lang w:eastAsia="en-ID"/>
+        </w:rPr>
+        <w:t>NOMOR :</w:t>
+      </w:r>
+      <w:proofErr w:type="gramEnd"/>
+      <w:r>
+        <w:rPr>
+          <w:rFonts w:ascii="Times New Roman" w:eastAsia="Times New Roman" w:hAnsi="Times New Roman" w:cs="Times New Roman"/>
+          <w:sz w:val="24"/>
+          <w:szCs w:val="24"/>
+          <w:lang w:eastAsia="en-ID"/>
+        </w:rPr>
+        <w:t xml:space="preserve"> </w:t>
       </w:r>
       <w:r>
         <w:rPr>
@@ -699,6 +710,7 @@
         <w:t xml:space="preserve"> </w:t>
       </w:r>
       <w:proofErr w:type="spellStart"/>
+      <w:proofErr w:type="gramStart"/>
       <w:r>
         <w:rPr>
           <w:rFonts w:ascii="Times New Roman" w:eastAsia="Times New Roman" w:hAnsi="Times New Roman" w:cs="Times New Roman"/>
@@ -716,7 +728,17 @@
           <w:szCs w:val="24"/>
           <w:lang w:eastAsia="en-ID"/>
         </w:rPr>
-        <w:t xml:space="preserve"> : </w:t>
+        <w:t xml:space="preserve"> :</w:t>
+      </w:r>
+      <w:proofErr w:type="gramEnd"/>
+      <w:r>
+        <w:rPr>
+          <w:rFonts w:ascii="Times New Roman" w:eastAsia="Times New Roman" w:hAnsi="Times New Roman" w:cs="Times New Roman"/>
+          <w:sz w:val="24"/>
+          <w:szCs w:val="24"/>
+          <w:lang w:eastAsia="en-ID"/>
+        </w:rPr>
+        <w:t xml:space="preserve"> </w:t>
       </w:r>
     </w:p>
     <w:p>
@@ -945,6 +967,7 @@
         <w:t xml:space="preserve"> </w:t>
       </w:r>
       <w:proofErr w:type="spellStart"/>
+      <w:proofErr w:type="gramStart"/>
       <w:r>
         <w:rPr>
           <w:rFonts w:ascii="Times New Roman" w:eastAsia="Times New Roman" w:hAnsi="Times New Roman" w:cs="Times New Roman"/>
@@ -964,6 +987,7 @@
         </w:rPr>
         <w:t xml:space="preserve"> :</w:t>
       </w:r>
+      <w:proofErr w:type="gramEnd"/>
     </w:p>
     <w:p>
       <w:pPr>
@@ -1885,6 +1909,7 @@
         <w:t xml:space="preserve"> di </w:t>
       </w:r>
       <w:proofErr w:type="spellStart"/>
+      <w:proofErr w:type="gramStart"/>
       <w:r>
         <w:rPr>
           <w:rFonts w:ascii="Times New Roman" w:eastAsia="Times New Roman" w:hAnsi="Times New Roman" w:cs="Times New Roman"/>
@@ -1902,7 +1927,17 @@
           <w:szCs w:val="24"/>
           <w:lang w:eastAsia="en-ID"/>
         </w:rPr>
-        <w:t xml:space="preserve"> : </w:t>
+        <w:t xml:space="preserve"> :</w:t>
+      </w:r>
+      <w:proofErr w:type="gramEnd"/>
+      <w:r>
+        <w:rPr>
+          <w:rFonts w:ascii="Times New Roman" w:eastAsia="Times New Roman" w:hAnsi="Times New Roman" w:cs="Times New Roman"/>
+          <w:sz w:val="24"/>
+          <w:szCs w:val="24"/>
+          <w:lang w:eastAsia="en-ID"/>
+        </w:rPr>
+        <w:t xml:space="preserve"> </w:t>
       </w:r>
     </w:p>
     <w:p>
@@ -2616,6 +2651,7 @@
         <w:t xml:space="preserve"> </w:t>
       </w:r>
       <w:proofErr w:type="spellStart"/>
+      <w:proofErr w:type="gramStart"/>
       <w:r>
         <w:rPr>
           <w:rFonts w:ascii="Times New Roman" w:eastAsia="Times New Roman" w:hAnsi="Times New Roman" w:cs="Times New Roman"/>
@@ -2644,6 +2680,7 @@
         </w:rPr>
         <w:t>:</w:t>
       </w:r>
+      <w:proofErr w:type="gramEnd"/>
       <w:r>
         <w:rPr>
           <w:rFonts w:ascii="Times New Roman" w:eastAsia="Times New Roman" w:hAnsi="Times New Roman" w:cs="Times New Roman"/>
@@ -3178,17 +3215,6 @@
           <w:lang w:val="id-ID" w:eastAsia="en-ID"/>
         </w:rPr>
       </w:pPr>
-      <w:r>
-        <w:rPr>
-          <w:rFonts w:ascii="Times New Roman" w:eastAsia="Times New Roman" w:hAnsi="Times New Roman" w:cs="Times New Roman"/>
-          <w:b/>
-          <w:bCs/>
-          <w:sz w:val="24"/>
-          <w:szCs w:val="24"/>
-          <w:lang w:val="id-ID" w:eastAsia="en-ID"/>
-        </w:rPr>
-        <w:t xml:space="preserve">     </w:t>
-      </w:r>
       <w:r>
         <w:rPr>
           <w:rFonts w:ascii="Times New Roman" w:eastAsia="Times New Roman" w:hAnsi="Times New Roman" w:cs="Times New Roman"/>
@@ -3662,6 +3688,7 @@
   <w:style w:type="character" w:default="1" w:styleId="DefaultParagraphFont">
     <w:name w:val="Default Paragraph Font"/>
     <w:uiPriority w:val="1"/>
+    <w:semiHidden/>
     <w:unhideWhenUsed/>
   </w:style>
   <w:style w:type="table" w:default="1" w:styleId="TableNormal">

</xml_diff>